<commit_message>
updated quarto.yml to only show a sidebar @niranjan-chhawdi
</commit_message>
<xml_diff>
--- a/docs/index.docx
+++ b/docs/index.docx
@@ -2,6 +2,58 @@
 <file path=word/document.xml><?xml version="1.0" encoding="utf-8"?>
 <w:document xmlns:w="http://schemas.openxmlformats.org/wordprocessingml/2006/main" xmlns:m="http://schemas.openxmlformats.org/officeDocument/2006/math" xmlns:r="http://schemas.openxmlformats.org/officeDocument/2006/relationships" xmlns:o="urn:schemas-microsoft-com:office:office" xmlns:v="urn:schemas-microsoft-com:vml" xmlns:w10="urn:schemas-microsoft-com:office:word" xmlns:a="http://schemas.openxmlformats.org/drawingml/2006/main" xmlns:pic="http://schemas.openxmlformats.org/drawingml/2006/picture" xmlns:wp="http://schemas.openxmlformats.org/drawingml/2006/wordprocessingDrawing">
   <w:body>
+    <w:p>
+      <w:pPr>
+        <w:pStyle w:val="Author"/>
+      </w:pPr>
+      <w:r>
+        <w:t xml:space="preserve">Colin</w:t>
+      </w:r>
+      <w:r>
+        <w:t xml:space="preserve"> </w:t>
+      </w:r>
+      <w:r>
+        <w:t xml:space="preserve">Madland</w:t>
+      </w:r>
+      <w:r>
+        <w:t xml:space="preserve"> </w:t>
+      </w:r>
+      <w:r>
+        <w:t xml:space="preserve">and</w:t>
+      </w:r>
+      <w:r>
+        <w:t xml:space="preserve"> </w:t>
+      </w:r>
+      <w:r>
+        <w:t xml:space="preserve">Kelly</w:t>
+      </w:r>
+      <w:r>
+        <w:t xml:space="preserve"> </w:t>
+      </w:r>
+      <w:r>
+        <w:t xml:space="preserve">Marjanovic</w:t>
+      </w:r>
+    </w:p>
+    <w:p>
+      <w:pPr>
+        <w:pStyle w:val="Date"/>
+      </w:pPr>
+      <w:r>
+        <w:t xml:space="preserve">Dec</w:t>
+      </w:r>
+      <w:r>
+        <w:t xml:space="preserve"> </w:t>
+      </w:r>
+      <w:r>
+        <w:t xml:space="preserve">12,</w:t>
+      </w:r>
+      <w:r>
+        <w:t xml:space="preserve"> </w:t>
+      </w:r>
+      <w:r>
+        <w:t xml:space="preserve">2025</w:t>
+      </w:r>
+    </w:p>
     <w:p>
       <w:pPr>
         <w:pStyle w:val="Heading1"/>
@@ -279,11 +331,7 @@
         <w:t xml:space="preserve">&lt;End accordion&gt;</w:t>
       </w:r>
     </w:p>
-    <w:sectPr>
-      <w:footnotePr>
-        <w:numRestart w:val="eachSect"/>
-      </w:footnotePr>
-    </w:sectPr>
+    <w:sectPr/>
   </w:body>
 </w:document>
 </file>
@@ -561,6 +609,8 @@
     </w:pPr>
     <w:rPr>
       <w:rFonts w:asciiTheme="majorHAnsi" w:cstheme="majorBidi" w:eastAsiaTheme="majorEastAsia" w:hAnsiTheme="majorHAnsi"/>
+      <w:spacing w:val="-10"/>
+      <w:kern w:val="28"/>
       <w:sz w:val="56"/>
       <w:szCs w:val="56"/>
     </w:rPr>
@@ -573,13 +623,15 @@
     <w:rsid w:val="00A10FD9"/>
     <w:rPr>
       <w:rFonts w:asciiTheme="majorHAnsi" w:cstheme="majorBidi" w:eastAsiaTheme="majorEastAsia" w:hAnsiTheme="majorHAnsi"/>
+      <w:spacing w:val="-10"/>
+      <w:kern w:val="28"/>
       <w:sz w:val="56"/>
       <w:szCs w:val="56"/>
     </w:rPr>
   </w:style>
   <w:style w:styleId="Subtitle" w:type="paragraph">
     <w:name w:val="Subtitle"/>
-    <w:basedOn w:val="Title"/>
+    <w:basedOn w:val="Normal"/>
     <w:next w:val="BodyText"/>
     <w:link w:val="SubtitleChar"/>
     <w:uiPriority w:val="11"/>
@@ -592,6 +644,7 @@
     </w:pPr>
     <w:rPr>
       <w:rFonts w:cstheme="majorBidi" w:eastAsiaTheme="majorEastAsia"/>
+      <w:color w:themeColor="text1" w:themeTint="A6" w:val="595959"/>
       <w:spacing w:val="15"/>
       <w:sz w:val="28"/>
       <w:szCs w:val="28"/>
@@ -613,31 +666,23 @@
   </w:style>
   <w:style w:customStyle="1" w:styleId="Author" w:type="paragraph">
     <w:name w:val="Author"/>
-    <w:basedOn w:val="Title"/>
     <w:next w:val="BodyText"/>
     <w:qFormat/>
     <w:pPr>
       <w:keepNext/>
       <w:keepLines/>
-    </w:pPr>
-    <w:rPr>
-      <w:sz w:val="24"/>
-      <w:szCs w:val="24"/>
-    </w:rPr>
+      <w:jc w:val="center"/>
+    </w:pPr>
   </w:style>
   <w:style w:styleId="Date" w:type="paragraph">
     <w:name w:val="Date"/>
-    <w:basedOn w:val="Title"/>
     <w:next w:val="BodyText"/>
     <w:qFormat/>
     <w:pPr>
       <w:keepNext/>
       <w:keepLines/>
-    </w:pPr>
-    <w:rPr>
-      <w:sz w:val="24"/>
-      <w:szCs w:val="24"/>
-    </w:rPr>
+      <w:jc w:val="center"/>
+    </w:pPr>
   </w:style>
   <w:style w:customStyle="1" w:styleId="AbstractTitle" w:type="paragraph">
     <w:name w:val="Abstract Title"/>
@@ -652,6 +697,7 @@
     </w:pPr>
     <w:rPr>
       <w:b/>
+      <w:color w:val="345A8A"/>
       <w:sz w:val="20"/>
       <w:szCs w:val="20"/>
     </w:rPr>

</xml_diff>